<commit_message>
Add acknowledgement to reports
</commit_message>
<xml_diff>
--- a/reports/IA1_Report.docx
+++ b/reports/IA1_Report.docx
@@ -329,7 +329,7 @@
       <w:r>
         <w:fldChar w:fldCharType="separate"/>
       </w:r>
-      <w:hyperlink w:anchor="_Toc243586419" w:history="1">
+      <w:hyperlink w:anchor="_Toc243586512" w:history="1">
         <w:r>
           <w:rPr>
             <w:rStyle w:val="Hyperlink"/>
@@ -356,7 +356,7 @@
             <w:noProof/>
             <w:webHidden/>
           </w:rPr>
-          <w:instrText xml:space="preserve"> PAGEREF _Toc243586419 \h </w:instrText>
+          <w:instrText xml:space="preserve"> PAGEREF _Toc243586512 \h </w:instrText>
         </w:r>
         <w:r>
           <w:rPr>
@@ -397,7 +397,7 @@
           <w:noProof/>
         </w:rPr>
       </w:pPr>
-      <w:hyperlink w:anchor="_Toc243586420" w:history="1">
+      <w:hyperlink w:anchor="_Toc243586513" w:history="1">
         <w:r>
           <w:rPr>
             <w:rStyle w:val="Hyperlink"/>
@@ -424,7 +424,7 @@
             <w:noProof/>
             <w:webHidden/>
           </w:rPr>
-          <w:instrText xml:space="preserve"> PAGEREF _Toc243586420 \h </w:instrText>
+          <w:instrText xml:space="preserve"> PAGEREF _Toc243586513 \h </w:instrText>
         </w:r>
         <w:r>
           <w:rPr>
@@ -465,7 +465,7 @@
           <w:noProof/>
         </w:rPr>
       </w:pPr>
-      <w:hyperlink w:anchor="_Toc243586421" w:history="1">
+      <w:hyperlink w:anchor="_Toc243586514" w:history="1">
         <w:r>
           <w:rPr>
             <w:rStyle w:val="Hyperlink"/>
@@ -492,7 +492,7 @@
             <w:noProof/>
             <w:webHidden/>
           </w:rPr>
-          <w:instrText xml:space="preserve"> PAGEREF _Toc243586421 \h </w:instrText>
+          <w:instrText xml:space="preserve"> PAGEREF _Toc243586514 \h </w:instrText>
         </w:r>
         <w:r>
           <w:rPr>
@@ -533,7 +533,7 @@
           <w:noProof/>
         </w:rPr>
       </w:pPr>
-      <w:hyperlink w:anchor="_Toc243586422" w:history="1">
+      <w:hyperlink w:anchor="_Toc243586515" w:history="1">
         <w:r>
           <w:rPr>
             <w:rStyle w:val="Hyperlink"/>
@@ -560,7 +560,7 @@
             <w:noProof/>
             <w:webHidden/>
           </w:rPr>
-          <w:instrText xml:space="preserve"> PAGEREF _Toc243586422 \h </w:instrText>
+          <w:instrText xml:space="preserve"> PAGEREF _Toc243586515 \h </w:instrText>
         </w:r>
         <w:r>
           <w:rPr>
@@ -601,7 +601,7 @@
           <w:noProof/>
         </w:rPr>
       </w:pPr>
-      <w:hyperlink w:anchor="_Toc243586423" w:history="1">
+      <w:hyperlink w:anchor="_Toc243586516" w:history="1">
         <w:r>
           <w:rPr>
             <w:rStyle w:val="Hyperlink"/>
@@ -628,7 +628,7 @@
             <w:noProof/>
             <w:webHidden/>
           </w:rPr>
-          <w:instrText xml:space="preserve"> PAGEREF _Toc243586423 \h </w:instrText>
+          <w:instrText xml:space="preserve"> PAGEREF _Toc243586516 \h </w:instrText>
         </w:r>
         <w:r>
           <w:rPr>
@@ -669,7 +669,7 @@
           <w:noProof/>
         </w:rPr>
       </w:pPr>
-      <w:hyperlink w:anchor="_Toc243586424" w:history="1">
+      <w:hyperlink w:anchor="_Toc243586517" w:history="1">
         <w:r>
           <w:rPr>
             <w:rStyle w:val="Hyperlink"/>
@@ -696,7 +696,7 @@
             <w:noProof/>
             <w:webHidden/>
           </w:rPr>
-          <w:instrText xml:space="preserve"> PAGEREF _Toc243586424 \h </w:instrText>
+          <w:instrText xml:space="preserve"> PAGEREF _Toc243586517 \h </w:instrText>
         </w:r>
         <w:r>
           <w:rPr>
@@ -737,7 +737,7 @@
           <w:noProof/>
         </w:rPr>
       </w:pPr>
-      <w:hyperlink w:anchor="_Toc243586425" w:history="1">
+      <w:hyperlink w:anchor="_Toc243586518" w:history="1">
         <w:r>
           <w:rPr>
             <w:rStyle w:val="Hyperlink"/>
@@ -764,7 +764,7 @@
             <w:noProof/>
             <w:webHidden/>
           </w:rPr>
-          <w:instrText xml:space="preserve"> PAGEREF _Toc243586425 \h </w:instrText>
+          <w:instrText xml:space="preserve"> PAGEREF _Toc243586518 \h </w:instrText>
         </w:r>
         <w:r>
           <w:rPr>
@@ -805,7 +805,7 @@
           <w:noProof/>
         </w:rPr>
       </w:pPr>
-      <w:hyperlink w:anchor="_Toc243586426" w:history="1">
+      <w:hyperlink w:anchor="_Toc243586519" w:history="1">
         <w:r>
           <w:rPr>
             <w:rStyle w:val="Hyperlink"/>
@@ -832,7 +832,7 @@
             <w:noProof/>
             <w:webHidden/>
           </w:rPr>
-          <w:instrText xml:space="preserve"> PAGEREF _Toc243586426 \h </w:instrText>
+          <w:instrText xml:space="preserve"> PAGEREF _Toc243586519 \h </w:instrText>
         </w:r>
         <w:r>
           <w:rPr>
@@ -873,7 +873,7 @@
           <w:noProof/>
         </w:rPr>
       </w:pPr>
-      <w:hyperlink w:anchor="_Toc243586427" w:history="1">
+      <w:hyperlink w:anchor="_Toc243586520" w:history="1">
         <w:r>
           <w:rPr>
             <w:rStyle w:val="Hyperlink"/>
@@ -900,7 +900,7 @@
             <w:noProof/>
             <w:webHidden/>
           </w:rPr>
-          <w:instrText xml:space="preserve"> PAGEREF _Toc243586427 \h </w:instrText>
+          <w:instrText xml:space="preserve"> PAGEREF _Toc243586520 \h </w:instrText>
         </w:r>
         <w:r>
           <w:rPr>
@@ -941,7 +941,7 @@
           <w:noProof/>
         </w:rPr>
       </w:pPr>
-      <w:hyperlink w:anchor="_Toc243586428" w:history="1">
+      <w:hyperlink w:anchor="_Toc243586521" w:history="1">
         <w:r>
           <w:rPr>
             <w:rStyle w:val="Hyperlink"/>
@@ -968,7 +968,7 @@
             <w:noProof/>
             <w:webHidden/>
           </w:rPr>
-          <w:instrText xml:space="preserve"> PAGEREF _Toc243586428 \h </w:instrText>
+          <w:instrText xml:space="preserve"> PAGEREF _Toc243586521 \h </w:instrText>
         </w:r>
         <w:r>
           <w:rPr>
@@ -1009,7 +1009,7 @@
           <w:noProof/>
         </w:rPr>
       </w:pPr>
-      <w:hyperlink w:anchor="_Toc243586429" w:history="1">
+      <w:hyperlink w:anchor="_Toc243586522" w:history="1">
         <w:r>
           <w:rPr>
             <w:rStyle w:val="Hyperlink"/>
@@ -1036,7 +1036,7 @@
             <w:noProof/>
             <w:webHidden/>
           </w:rPr>
-          <w:instrText xml:space="preserve"> PAGEREF _Toc243586429 \h </w:instrText>
+          <w:instrText xml:space="preserve"> PAGEREF _Toc243586522 \h </w:instrText>
         </w:r>
         <w:r>
           <w:rPr>
@@ -1077,7 +1077,7 @@
           <w:noProof/>
         </w:rPr>
       </w:pPr>
-      <w:hyperlink w:anchor="_Toc243586430" w:history="1">
+      <w:hyperlink w:anchor="_Toc243586523" w:history="1">
         <w:r>
           <w:rPr>
             <w:rStyle w:val="Hyperlink"/>
@@ -1104,7 +1104,7 @@
             <w:noProof/>
             <w:webHidden/>
           </w:rPr>
-          <w:instrText xml:space="preserve"> PAGEREF _Toc243586430 \h </w:instrText>
+          <w:instrText xml:space="preserve"> PAGEREF _Toc243586523 \h </w:instrText>
         </w:r>
         <w:r>
           <w:rPr>
@@ -1145,7 +1145,7 @@
           <w:noProof/>
         </w:rPr>
       </w:pPr>
-      <w:hyperlink w:anchor="_Toc243586431" w:history="1">
+      <w:hyperlink w:anchor="_Toc243586524" w:history="1">
         <w:r>
           <w:rPr>
             <w:rStyle w:val="Hyperlink"/>
@@ -1172,7 +1172,7 @@
             <w:noProof/>
             <w:webHidden/>
           </w:rPr>
-          <w:instrText xml:space="preserve"> PAGEREF _Toc243586431 \h </w:instrText>
+          <w:instrText xml:space="preserve"> PAGEREF _Toc243586524 \h </w:instrText>
         </w:r>
         <w:r>
           <w:rPr>
@@ -1213,7 +1213,7 @@
           <w:noProof/>
         </w:rPr>
       </w:pPr>
-      <w:hyperlink w:anchor="_Toc243586432" w:history="1">
+      <w:hyperlink w:anchor="_Toc243586525" w:history="1">
         <w:r>
           <w:rPr>
             <w:rStyle w:val="Hyperlink"/>
@@ -1240,7 +1240,7 @@
             <w:noProof/>
             <w:webHidden/>
           </w:rPr>
-          <w:instrText xml:space="preserve"> PAGEREF _Toc243586432 \h </w:instrText>
+          <w:instrText xml:space="preserve"> PAGEREF _Toc243586525 \h </w:instrText>
         </w:r>
         <w:r>
           <w:rPr>
@@ -1281,7 +1281,7 @@
           <w:noProof/>
         </w:rPr>
       </w:pPr>
-      <w:hyperlink w:anchor="_Toc243586433" w:history="1">
+      <w:hyperlink w:anchor="_Toc243586526" w:history="1">
         <w:r>
           <w:rPr>
             <w:rStyle w:val="Hyperlink"/>
@@ -1308,7 +1308,7 @@
             <w:noProof/>
             <w:webHidden/>
           </w:rPr>
-          <w:instrText xml:space="preserve"> PAGEREF _Toc243586433 \h </w:instrText>
+          <w:instrText xml:space="preserve"> PAGEREF _Toc243586526 \h </w:instrText>
         </w:r>
         <w:r>
           <w:rPr>
@@ -1349,7 +1349,7 @@
           <w:noProof/>
         </w:rPr>
       </w:pPr>
-      <w:hyperlink w:anchor="_Toc243586434" w:history="1">
+      <w:hyperlink w:anchor="_Toc243586527" w:history="1">
         <w:r>
           <w:rPr>
             <w:rStyle w:val="Hyperlink"/>
@@ -1376,7 +1376,7 @@
             <w:noProof/>
             <w:webHidden/>
           </w:rPr>
-          <w:instrText xml:space="preserve"> PAGEREF _Toc243586434 \h </w:instrText>
+          <w:instrText xml:space="preserve"> PAGEREF _Toc243586527 \h </w:instrText>
         </w:r>
         <w:r>
           <w:rPr>
@@ -1417,7 +1417,7 @@
           <w:noProof/>
         </w:rPr>
       </w:pPr>
-      <w:hyperlink w:anchor="_Toc243586435" w:history="1">
+      <w:hyperlink w:anchor="_Toc243586528" w:history="1">
         <w:r>
           <w:rPr>
             <w:rStyle w:val="Hyperlink"/>
@@ -1444,7 +1444,7 @@
             <w:noProof/>
             <w:webHidden/>
           </w:rPr>
-          <w:instrText xml:space="preserve"> PAGEREF _Toc243586435 \h </w:instrText>
+          <w:instrText xml:space="preserve"> PAGEREF _Toc243586528 \h </w:instrText>
         </w:r>
         <w:r>
           <w:rPr>
@@ -1485,7 +1485,7 @@
           <w:noProof/>
         </w:rPr>
       </w:pPr>
-      <w:hyperlink w:anchor="_Toc243586436" w:history="1">
+      <w:hyperlink w:anchor="_Toc243586529" w:history="1">
         <w:r>
           <w:rPr>
             <w:rStyle w:val="Hyperlink"/>
@@ -1512,7 +1512,7 @@
             <w:noProof/>
             <w:webHidden/>
           </w:rPr>
-          <w:instrText xml:space="preserve"> PAGEREF _Toc243586436 \h </w:instrText>
+          <w:instrText xml:space="preserve"> PAGEREF _Toc243586529 \h </w:instrText>
         </w:r>
         <w:r>
           <w:rPr>
@@ -1553,7 +1553,7 @@
           <w:noProof/>
         </w:rPr>
       </w:pPr>
-      <w:hyperlink w:anchor="_Toc243586437" w:history="1">
+      <w:hyperlink w:anchor="_Toc243586530" w:history="1">
         <w:r>
           <w:rPr>
             <w:rStyle w:val="Hyperlink"/>
@@ -1580,7 +1580,7 @@
             <w:noProof/>
             <w:webHidden/>
           </w:rPr>
-          <w:instrText xml:space="preserve"> PAGEREF _Toc243586437 \h </w:instrText>
+          <w:instrText xml:space="preserve"> PAGEREF _Toc243586530 \h </w:instrText>
         </w:r>
         <w:r>
           <w:rPr>
@@ -1621,7 +1621,7 @@
           <w:noProof/>
         </w:rPr>
       </w:pPr>
-      <w:hyperlink w:anchor="_Toc243586438" w:history="1">
+      <w:hyperlink w:anchor="_Toc243586531" w:history="1">
         <w:r>
           <w:rPr>
             <w:rStyle w:val="Hyperlink"/>
@@ -1648,7 +1648,7 @@
             <w:noProof/>
             <w:webHidden/>
           </w:rPr>
-          <w:instrText xml:space="preserve"> PAGEREF _Toc243586438 \h </w:instrText>
+          <w:instrText xml:space="preserve"> PAGEREF _Toc243586531 \h </w:instrText>
         </w:r>
         <w:r>
           <w:rPr>
@@ -1689,7 +1689,7 @@
           <w:noProof/>
         </w:rPr>
       </w:pPr>
-      <w:hyperlink w:anchor="_Toc243586439" w:history="1">
+      <w:hyperlink w:anchor="_Toc243586532" w:history="1">
         <w:r>
           <w:rPr>
             <w:rStyle w:val="Hyperlink"/>
@@ -1716,7 +1716,7 @@
             <w:noProof/>
             <w:webHidden/>
           </w:rPr>
-          <w:instrText xml:space="preserve"> PAGEREF _Toc243586439 \h </w:instrText>
+          <w:instrText xml:space="preserve"> PAGEREF _Toc243586532 \h </w:instrText>
         </w:r>
         <w:r>
           <w:rPr>
@@ -1757,7 +1757,7 @@
           <w:noProof/>
         </w:rPr>
       </w:pPr>
-      <w:hyperlink w:anchor="_Toc243586440" w:history="1">
+      <w:hyperlink w:anchor="_Toc243586533" w:history="1">
         <w:r>
           <w:rPr>
             <w:rStyle w:val="Hyperlink"/>
@@ -1784,7 +1784,7 @@
             <w:noProof/>
             <w:webHidden/>
           </w:rPr>
-          <w:instrText xml:space="preserve"> PAGEREF _Toc243586440 \h </w:instrText>
+          <w:instrText xml:space="preserve"> PAGEREF _Toc243586533 \h </w:instrText>
         </w:r>
         <w:r>
           <w:rPr>
@@ -1825,7 +1825,7 @@
           <w:noProof/>
         </w:rPr>
       </w:pPr>
-      <w:hyperlink w:anchor="_Toc243586441" w:history="1">
+      <w:hyperlink w:anchor="_Toc243586534" w:history="1">
         <w:r>
           <w:rPr>
             <w:rStyle w:val="Hyperlink"/>
@@ -1852,7 +1852,7 @@
             <w:noProof/>
             <w:webHidden/>
           </w:rPr>
-          <w:instrText xml:space="preserve"> PAGEREF _Toc243586441 \h </w:instrText>
+          <w:instrText xml:space="preserve"> PAGEREF _Toc243586534 \h </w:instrText>
         </w:r>
         <w:r>
           <w:rPr>
@@ -1893,7 +1893,7 @@
           <w:noProof/>
         </w:rPr>
       </w:pPr>
-      <w:hyperlink w:anchor="_Toc243586442" w:history="1">
+      <w:hyperlink w:anchor="_Toc243586535" w:history="1">
         <w:r>
           <w:rPr>
             <w:rStyle w:val="Hyperlink"/>
@@ -1920,7 +1920,7 @@
             <w:noProof/>
             <w:webHidden/>
           </w:rPr>
-          <w:instrText xml:space="preserve"> PAGEREF _Toc243586442 \h </w:instrText>
+          <w:instrText xml:space="preserve"> PAGEREF _Toc243586535 \h </w:instrText>
         </w:r>
         <w:r>
           <w:rPr>
@@ -1961,7 +1961,7 @@
           <w:noProof/>
         </w:rPr>
       </w:pPr>
-      <w:hyperlink w:anchor="_Toc243586443" w:history="1">
+      <w:hyperlink w:anchor="_Toc243586536" w:history="1">
         <w:r>
           <w:rPr>
             <w:rStyle w:val="Hyperlink"/>
@@ -1988,7 +1988,7 @@
             <w:noProof/>
             <w:webHidden/>
           </w:rPr>
-          <w:instrText xml:space="preserve"> PAGEREF _Toc243586443 \h </w:instrText>
+          <w:instrText xml:space="preserve"> PAGEREF _Toc243586536 \h </w:instrText>
         </w:r>
         <w:r>
           <w:rPr>
@@ -2029,7 +2029,7 @@
           <w:noProof/>
         </w:rPr>
       </w:pPr>
-      <w:hyperlink w:anchor="_Toc243586444" w:history="1">
+      <w:hyperlink w:anchor="_Toc243586537" w:history="1">
         <w:r>
           <w:rPr>
             <w:rStyle w:val="Hyperlink"/>
@@ -2056,7 +2056,7 @@
             <w:noProof/>
             <w:webHidden/>
           </w:rPr>
-          <w:instrText xml:space="preserve"> PAGEREF _Toc243586444 \h </w:instrText>
+          <w:instrText xml:space="preserve"> PAGEREF _Toc243586537 \h </w:instrText>
         </w:r>
         <w:r>
           <w:rPr>
@@ -2097,7 +2097,7 @@
           <w:noProof/>
         </w:rPr>
       </w:pPr>
-      <w:hyperlink w:anchor="_Toc243586445" w:history="1">
+      <w:hyperlink w:anchor="_Toc243586538" w:history="1">
         <w:r>
           <w:rPr>
             <w:rStyle w:val="Hyperlink"/>
@@ -2124,7 +2124,7 @@
             <w:noProof/>
             <w:webHidden/>
           </w:rPr>
-          <w:instrText xml:space="preserve"> PAGEREF _Toc243586445 \h </w:instrText>
+          <w:instrText xml:space="preserve"> PAGEREF _Toc243586538 \h </w:instrText>
         </w:r>
         <w:r>
           <w:rPr>
@@ -2165,7 +2165,7 @@
           <w:noProof/>
         </w:rPr>
       </w:pPr>
-      <w:hyperlink w:anchor="_Toc243586446" w:history="1">
+      <w:hyperlink w:anchor="_Toc243586539" w:history="1">
         <w:r>
           <w:rPr>
             <w:rStyle w:val="Hyperlink"/>
@@ -2192,7 +2192,7 @@
             <w:noProof/>
             <w:webHidden/>
           </w:rPr>
-          <w:instrText xml:space="preserve"> PAGEREF _Toc243586446 \h </w:instrText>
+          <w:instrText xml:space="preserve"> PAGEREF _Toc243586539 \h </w:instrText>
         </w:r>
         <w:r>
           <w:rPr>
@@ -2233,7 +2233,7 @@
           <w:noProof/>
         </w:rPr>
       </w:pPr>
-      <w:hyperlink w:anchor="_Toc243586447" w:history="1">
+      <w:hyperlink w:anchor="_Toc243586540" w:history="1">
         <w:r>
           <w:rPr>
             <w:rStyle w:val="Hyperlink"/>
@@ -2260,7 +2260,7 @@
             <w:noProof/>
             <w:webHidden/>
           </w:rPr>
-          <w:instrText xml:space="preserve"> PAGEREF _Toc243586447 \h </w:instrText>
+          <w:instrText xml:space="preserve"> PAGEREF _Toc243586540 \h </w:instrText>
         </w:r>
         <w:r>
           <w:rPr>
@@ -2301,7 +2301,7 @@
           <w:noProof/>
         </w:rPr>
       </w:pPr>
-      <w:hyperlink w:anchor="_Toc243586448" w:history="1">
+      <w:hyperlink w:anchor="_Toc243586541" w:history="1">
         <w:r>
           <w:rPr>
             <w:rStyle w:val="Hyperlink"/>
@@ -2328,7 +2328,7 @@
             <w:noProof/>
             <w:webHidden/>
           </w:rPr>
-          <w:instrText xml:space="preserve"> PAGEREF _Toc243586448 \h </w:instrText>
+          <w:instrText xml:space="preserve"> PAGEREF _Toc243586541 \h </w:instrText>
         </w:r>
         <w:r>
           <w:rPr>
@@ -2369,7 +2369,7 @@
           <w:noProof/>
         </w:rPr>
       </w:pPr>
-      <w:hyperlink w:anchor="_Toc243586449" w:history="1">
+      <w:hyperlink w:anchor="_Toc243586542" w:history="1">
         <w:r>
           <w:rPr>
             <w:rStyle w:val="Hyperlink"/>
@@ -2396,7 +2396,7 @@
             <w:noProof/>
             <w:webHidden/>
           </w:rPr>
-          <w:instrText xml:space="preserve"> PAGEREF _Toc243586449 \h </w:instrText>
+          <w:instrText xml:space="preserve"> PAGEREF _Toc243586542 \h </w:instrText>
         </w:r>
         <w:r>
           <w:rPr>
@@ -2437,7 +2437,7 @@
           <w:noProof/>
         </w:rPr>
       </w:pPr>
-      <w:hyperlink w:anchor="_Toc243586450" w:history="1">
+      <w:hyperlink w:anchor="_Toc243586543" w:history="1">
         <w:r>
           <w:rPr>
             <w:rStyle w:val="Hyperlink"/>
@@ -2464,7 +2464,7 @@
             <w:noProof/>
             <w:webHidden/>
           </w:rPr>
-          <w:instrText xml:space="preserve"> PAGEREF _Toc243586450 \h </w:instrText>
+          <w:instrText xml:space="preserve"> PAGEREF _Toc243586543 \h </w:instrText>
         </w:r>
         <w:r>
           <w:rPr>
@@ -2505,7 +2505,7 @@
           <w:noProof/>
         </w:rPr>
       </w:pPr>
-      <w:hyperlink w:anchor="_Toc243586451" w:history="1">
+      <w:hyperlink w:anchor="_Toc243586544" w:history="1">
         <w:r>
           <w:rPr>
             <w:rStyle w:val="Hyperlink"/>
@@ -2532,7 +2532,7 @@
             <w:noProof/>
             <w:webHidden/>
           </w:rPr>
-          <w:instrText xml:space="preserve"> PAGEREF _Toc243586451 \h </w:instrText>
+          <w:instrText xml:space="preserve"> PAGEREF _Toc243586544 \h </w:instrText>
         </w:r>
         <w:r>
           <w:rPr>
@@ -2573,7 +2573,7 @@
           <w:noProof/>
         </w:rPr>
       </w:pPr>
-      <w:hyperlink w:anchor="_Toc243586452" w:history="1">
+      <w:hyperlink w:anchor="_Toc243586545" w:history="1">
         <w:r>
           <w:rPr>
             <w:rStyle w:val="Hyperlink"/>
@@ -2600,7 +2600,7 @@
             <w:noProof/>
             <w:webHidden/>
           </w:rPr>
-          <w:instrText xml:space="preserve"> PAGEREF _Toc243586452 \h </w:instrText>
+          <w:instrText xml:space="preserve"> PAGEREF _Toc243586545 \h </w:instrText>
         </w:r>
         <w:r>
           <w:rPr>
@@ -2641,7 +2641,7 @@
           <w:noProof/>
         </w:rPr>
       </w:pPr>
-      <w:hyperlink w:anchor="_Toc243586453" w:history="1">
+      <w:hyperlink w:anchor="_Toc243586546" w:history="1">
         <w:r>
           <w:rPr>
             <w:rStyle w:val="Hyperlink"/>
@@ -2668,7 +2668,7 @@
             <w:noProof/>
             <w:webHidden/>
           </w:rPr>
-          <w:instrText xml:space="preserve"> PAGEREF _Toc243586453 \h </w:instrText>
+          <w:instrText xml:space="preserve"> PAGEREF _Toc243586546 \h </w:instrText>
         </w:r>
         <w:r>
           <w:rPr>
@@ -2709,7 +2709,7 @@
           <w:noProof/>
         </w:rPr>
       </w:pPr>
-      <w:hyperlink w:anchor="_Toc243586454" w:history="1">
+      <w:hyperlink w:anchor="_Toc243586547" w:history="1">
         <w:r>
           <w:rPr>
             <w:rStyle w:val="Hyperlink"/>
@@ -2736,7 +2736,7 @@
             <w:noProof/>
             <w:webHidden/>
           </w:rPr>
-          <w:instrText xml:space="preserve"> PAGEREF _Toc243586454 \h </w:instrText>
+          <w:instrText xml:space="preserve"> PAGEREF _Toc243586547 \h </w:instrText>
         </w:r>
         <w:r>
           <w:rPr>
@@ -2777,7 +2777,7 @@
           <w:noProof/>
         </w:rPr>
       </w:pPr>
-      <w:hyperlink w:anchor="_Toc243586455" w:history="1">
+      <w:hyperlink w:anchor="_Toc243586548" w:history="1">
         <w:r>
           <w:rPr>
             <w:rStyle w:val="Hyperlink"/>
@@ -2804,7 +2804,7 @@
             <w:noProof/>
             <w:webHidden/>
           </w:rPr>
-          <w:instrText xml:space="preserve"> PAGEREF _Toc243586455 \h </w:instrText>
+          <w:instrText xml:space="preserve"> PAGEREF _Toc243586548 \h </w:instrText>
         </w:r>
         <w:r>
           <w:rPr>
@@ -2845,7 +2845,7 @@
           <w:noProof/>
         </w:rPr>
       </w:pPr>
-      <w:hyperlink w:anchor="_Toc243586456" w:history="1">
+      <w:hyperlink w:anchor="_Toc243586549" w:history="1">
         <w:r>
           <w:rPr>
             <w:rStyle w:val="Hyperlink"/>
@@ -2872,7 +2872,7 @@
             <w:noProof/>
             <w:webHidden/>
           </w:rPr>
-          <w:instrText xml:space="preserve"> PAGEREF _Toc243586456 \h </w:instrText>
+          <w:instrText xml:space="preserve"> PAGEREF _Toc243586549 \h </w:instrText>
         </w:r>
         <w:r>
           <w:rPr>
@@ -2913,7 +2913,7 @@
           <w:noProof/>
         </w:rPr>
       </w:pPr>
-      <w:hyperlink w:anchor="_Toc243586457" w:history="1">
+      <w:hyperlink w:anchor="_Toc243586550" w:history="1">
         <w:r>
           <w:rPr>
             <w:rStyle w:val="Hyperlink"/>
@@ -2940,7 +2940,7 @@
             <w:noProof/>
             <w:webHidden/>
           </w:rPr>
-          <w:instrText xml:space="preserve"> PAGEREF _Toc243586457 \h </w:instrText>
+          <w:instrText xml:space="preserve"> PAGEREF _Toc243586550 \h </w:instrText>
         </w:r>
         <w:r>
           <w:rPr>
@@ -2981,7 +2981,7 @@
           <w:noProof/>
         </w:rPr>
       </w:pPr>
-      <w:hyperlink w:anchor="_Toc243586458" w:history="1">
+      <w:hyperlink w:anchor="_Toc243586551" w:history="1">
         <w:r>
           <w:rPr>
             <w:rStyle w:val="Hyperlink"/>
@@ -3008,7 +3008,7 @@
             <w:noProof/>
             <w:webHidden/>
           </w:rPr>
-          <w:instrText xml:space="preserve"> PAGEREF _Toc243586458 \h </w:instrText>
+          <w:instrText xml:space="preserve"> PAGEREF _Toc243586551 \h </w:instrText>
         </w:r>
         <w:r>
           <w:rPr>
@@ -3049,7 +3049,7 @@
           <w:noProof/>
         </w:rPr>
       </w:pPr>
-      <w:hyperlink w:anchor="_Toc243586459" w:history="1">
+      <w:hyperlink w:anchor="_Toc243586552" w:history="1">
         <w:r>
           <w:rPr>
             <w:rStyle w:val="Hyperlink"/>
@@ -3076,7 +3076,7 @@
             <w:noProof/>
             <w:webHidden/>
           </w:rPr>
-          <w:instrText xml:space="preserve"> PAGEREF _Toc243586459 \h </w:instrText>
+          <w:instrText xml:space="preserve"> PAGEREF _Toc243586552 \h </w:instrText>
         </w:r>
         <w:r>
           <w:rPr>
@@ -3117,7 +3117,7 @@
           <w:noProof/>
         </w:rPr>
       </w:pPr>
-      <w:hyperlink w:anchor="_Toc243586460" w:history="1">
+      <w:hyperlink w:anchor="_Toc243586553" w:history="1">
         <w:r>
           <w:rPr>
             <w:rStyle w:val="Hyperlink"/>
@@ -3144,7 +3144,7 @@
             <w:noProof/>
             <w:webHidden/>
           </w:rPr>
-          <w:instrText xml:space="preserve"> PAGEREF _Toc243586460 \h </w:instrText>
+          <w:instrText xml:space="preserve"> PAGEREF _Toc243586553 \h </w:instrText>
         </w:r>
         <w:r>
           <w:rPr>
@@ -3185,7 +3185,7 @@
           <w:noProof/>
         </w:rPr>
       </w:pPr>
-      <w:hyperlink w:anchor="_Toc243586461" w:history="1">
+      <w:hyperlink w:anchor="_Toc243586554" w:history="1">
         <w:r>
           <w:rPr>
             <w:rStyle w:val="Hyperlink"/>
@@ -3212,7 +3212,7 @@
             <w:noProof/>
             <w:webHidden/>
           </w:rPr>
-          <w:instrText xml:space="preserve"> PAGEREF _Toc243586461 \h </w:instrText>
+          <w:instrText xml:space="preserve"> PAGEREF _Toc243586554 \h </w:instrText>
         </w:r>
         <w:r>
           <w:rPr>
@@ -3253,13 +3253,13 @@
           <w:noProof/>
         </w:rPr>
       </w:pPr>
-      <w:hyperlink w:anchor="_Toc243586462" w:history="1">
+      <w:hyperlink w:anchor="_Toc243586555" w:history="1">
         <w:r>
           <w:rPr>
             <w:rStyle w:val="Hyperlink"/>
             <w:noProof/>
           </w:rPr>
-          <w:t>References</w:t>
+          <w:t>Acknowledgement</w:t>
         </w:r>
         <w:r>
           <w:rPr>
@@ -3280,7 +3280,7 @@
             <w:noProof/>
             <w:webHidden/>
           </w:rPr>
-          <w:instrText xml:space="preserve"> PAGEREF _Toc243586462 \h </w:instrText>
+          <w:instrText xml:space="preserve"> PAGEREF _Toc243586555 \h </w:instrText>
         </w:r>
         <w:r>
           <w:rPr>
@@ -3312,20 +3312,88 @@
       </w:hyperlink>
     </w:p>
     <w:p>
-      <w:r>
-        <w:fldChar w:fldCharType="end"/>
-      </w:r>
+      <w:pPr>
+        <w:pStyle w:val="TOC1"/>
+        <w:tabs>
+          <w:tab w:val="right" w:leader="dot" w:pos="9288"/>
+        </w:tabs>
+        <w:rPr>
+          <w:noProof/>
+        </w:rPr>
+      </w:pPr>
+      <w:hyperlink w:anchor="_Toc243586556" w:history="1">
+        <w:r>
+          <w:rPr>
+            <w:rStyle w:val="Hyperlink"/>
+            <w:noProof/>
+          </w:rPr>
+          <w:t>References</w:t>
+        </w:r>
+        <w:r>
+          <w:rPr>
+            <w:noProof/>
+            <w:webHidden/>
+          </w:rPr>
+          <w:tab/>
+        </w:r>
+        <w:r>
+          <w:rPr>
+            <w:noProof/>
+            <w:webHidden/>
+          </w:rPr>
+          <w:fldChar w:fldCharType="begin"/>
+        </w:r>
+        <w:r>
+          <w:rPr>
+            <w:noProof/>
+            <w:webHidden/>
+          </w:rPr>
+          <w:instrText xml:space="preserve"> PAGEREF _Toc243586556 \h </w:instrText>
+        </w:r>
+        <w:r>
+          <w:rPr>
+            <w:noProof/>
+            <w:webHidden/>
+          </w:rPr>
+        </w:r>
+        <w:r>
+          <w:rPr>
+            <w:noProof/>
+            <w:webHidden/>
+          </w:rPr>
+          <w:fldChar w:fldCharType="separate"/>
+        </w:r>
+        <w:r>
+          <w:rPr>
+            <w:noProof/>
+            <w:webHidden/>
+          </w:rPr>
+          <w:t>18</w:t>
+        </w:r>
+        <w:r>
+          <w:rPr>
+            <w:noProof/>
+            <w:webHidden/>
+          </w:rPr>
+          <w:fldChar w:fldCharType="end"/>
+        </w:r>
+      </w:hyperlink>
     </w:p>
     <w:p>
       <w:r>
-        <w:br w:type="page"/>
+        <w:fldChar w:fldCharType="end"/>
       </w:r>
     </w:p>
     <w:p>
+      <w:r>
+        <w:br w:type="page"/>
+      </w:r>
+    </w:p>
+    <w:p>
       <w:pPr>
         <w:pStyle w:val="Heading1"/>
       </w:pPr>
-      <w:bookmarkStart w:id="0" w:name="_Toc243586419"/>
+      <w:bookmarkStart w:id="0" w:name="_Toc243586512"/>
       <w:r>
         <w:lastRenderedPageBreak/>
         <w:t>Executive Summary</w:t>
@@ -3489,7 +3557,7 @@
       <w:pPr>
         <w:pStyle w:val="Heading2"/>
       </w:pPr>
-      <w:bookmarkStart w:id="1" w:name="_Toc243586420"/>
+      <w:bookmarkStart w:id="1" w:name="_Toc243586513"/>
       <w:r>
         <w:t>Rubric compliance map</w:t>
       </w:r>
@@ -3872,7 +3940,7 @@
       <w:pPr>
         <w:pStyle w:val="Heading1"/>
       </w:pPr>
-      <w:bookmarkStart w:id="2" w:name="_Toc243586421"/>
+      <w:bookmarkStart w:id="2" w:name="_Toc243586514"/>
       <w:r>
         <w:lastRenderedPageBreak/>
         <w:t>1. Problem Definition and Module Mapping</w:t>
@@ -3883,7 +3951,7 @@
       <w:pPr>
         <w:pStyle w:val="Heading2"/>
       </w:pPr>
-      <w:bookmarkStart w:id="3" w:name="_Toc243586422"/>
+      <w:bookmarkStart w:id="3" w:name="_Toc243586515"/>
       <w:r>
         <w:t>1.1 Background and motivation</w:t>
       </w:r>
@@ -3922,7 +3990,7 @@
       <w:pPr>
         <w:pStyle w:val="Heading2"/>
       </w:pPr>
-      <w:bookmarkStart w:id="4" w:name="_Toc243586423"/>
+      <w:bookmarkStart w:id="4" w:name="_Toc243586516"/>
       <w:r>
         <w:t>1.2 Problem statement</w:t>
       </w:r>
@@ -4003,7 +4071,7 @@
       <w:pPr>
         <w:pStyle w:val="Heading2"/>
       </w:pPr>
-      <w:bookmarkStart w:id="5" w:name="_Toc243586424"/>
+      <w:bookmarkStart w:id="5" w:name="_Toc243586517"/>
       <w:r>
         <w:t>1.3 Significance</w:t>
       </w:r>
@@ -4067,7 +4135,7 @@
       <w:pPr>
         <w:pStyle w:val="Heading2"/>
       </w:pPr>
-      <w:bookmarkStart w:id="6" w:name="_Toc243586425"/>
+      <w:bookmarkStart w:id="6" w:name="_Toc243586518"/>
       <w:r>
         <w:t>1.4 Objectives</w:t>
       </w:r>
@@ -4450,7 +4518,7 @@
       <w:pPr>
         <w:pStyle w:val="Heading2"/>
       </w:pPr>
-      <w:bookmarkStart w:id="7" w:name="_Toc243586426"/>
+      <w:bookmarkStart w:id="7" w:name="_Toc243586519"/>
       <w:r>
         <w:lastRenderedPageBreak/>
         <w:t>1.5 Scope</w:t>
@@ -4691,7 +4759,7 @@
       <w:pPr>
         <w:pStyle w:val="Heading2"/>
       </w:pPr>
-      <w:bookmarkStart w:id="8" w:name="_Toc243586427"/>
+      <w:bookmarkStart w:id="8" w:name="_Toc243586520"/>
       <w:r>
         <w:t>1.6 Expected outcomes</w:t>
       </w:r>
@@ -4756,7 +4824,7 @@
       <w:pPr>
         <w:pStyle w:val="Heading2"/>
       </w:pPr>
-      <w:bookmarkStart w:id="9" w:name="_Toc243586428"/>
+      <w:bookmarkStart w:id="9" w:name="_Toc243586521"/>
       <w:r>
         <w:t>1.7 Module-wise concept mapping</w:t>
       </w:r>
@@ -5313,7 +5381,7 @@
       <w:pPr>
         <w:pStyle w:val="Heading1"/>
       </w:pPr>
-      <w:bookmarkStart w:id="10" w:name="_Toc243586429"/>
+      <w:bookmarkStart w:id="10" w:name="_Toc243586522"/>
       <w:r>
         <w:t>2. Conceptual Understanding</w:t>
       </w:r>
@@ -5323,7 +5391,7 @@
       <w:pPr>
         <w:pStyle w:val="Heading2"/>
       </w:pPr>
-      <w:bookmarkStart w:id="11" w:name="_Toc243586430"/>
+      <w:bookmarkStart w:id="11" w:name="_Toc243586523"/>
       <w:r>
         <w:t>2.1 Threat model</w:t>
       </w:r>
@@ -5698,7 +5766,7 @@
       <w:pPr>
         <w:pStyle w:val="Heading2"/>
       </w:pPr>
-      <w:bookmarkStart w:id="12" w:name="_Toc243586431"/>
+      <w:bookmarkStart w:id="12" w:name="_Toc243586524"/>
       <w:r>
         <w:t>2.2 Concept notes</w:t>
       </w:r>
@@ -6057,7 +6125,7 @@
       <w:pPr>
         <w:pStyle w:val="Heading2"/>
       </w:pPr>
-      <w:bookmarkStart w:id="13" w:name="_Toc243586432"/>
+      <w:bookmarkStart w:id="13" w:name="_Toc243586525"/>
       <w:r>
         <w:t>2.3 Methodology and workflow</w:t>
       </w:r>
@@ -6073,7 +6141,7 @@
           <w:noProof/>
         </w:rPr>
         <w:drawing>
-          <wp:inline distT="0" distB="0" distL="0" distR="0" wp14:anchorId="6708B829" wp14:editId="548DF9CD">
+          <wp:inline distT="0" distB="0" distL="0" distR="0" wp14:anchorId="6127A3C7" wp14:editId="48C2EAB3">
             <wp:extent cx="5760000" cy="3407698"/>
             <wp:effectExtent l="0" t="0" r="0" b="0"/>
             <wp:docPr id="1" name="Picture 1"/>
@@ -6203,7 +6271,7 @@
       <w:pPr>
         <w:pStyle w:val="Heading2"/>
       </w:pPr>
-      <w:bookmarkStart w:id="14" w:name="_Toc243586433"/>
+      <w:bookmarkStart w:id="14" w:name="_Toc243586526"/>
       <w:r>
         <w:lastRenderedPageBreak/>
         <w:t>2.4 Justification for concept selection</w:t>
@@ -6587,7 +6655,7 @@
       <w:pPr>
         <w:pStyle w:val="Heading2"/>
       </w:pPr>
-      <w:bookmarkStart w:id="15" w:name="_Toc243586434"/>
+      <w:bookmarkStart w:id="15" w:name="_Toc243586527"/>
       <w:r>
         <w:t>2.5 Treatment of concepts</w:t>
       </w:r>
@@ -7592,7 +7660,7 @@
       <w:pPr>
         <w:pStyle w:val="Heading1"/>
       </w:pPr>
-      <w:bookmarkStart w:id="16" w:name="_Toc243586435"/>
+      <w:bookmarkStart w:id="16" w:name="_Toc243586528"/>
       <w:r>
         <w:t>3. Dataset Identification and Preliminary Preparation</w:t>
       </w:r>
@@ -7602,7 +7670,7 @@
       <w:pPr>
         <w:pStyle w:val="Heading2"/>
       </w:pPr>
-      <w:bookmarkStart w:id="17" w:name="_Toc243586436"/>
+      <w:bookmarkStart w:id="17" w:name="_Toc243586529"/>
       <w:r>
         <w:t>3.1 Dataset and suitability</w:t>
       </w:r>
@@ -7633,7 +7701,7 @@
       <w:pPr>
         <w:pStyle w:val="Heading2"/>
       </w:pPr>
-      <w:bookmarkStart w:id="18" w:name="_Toc243586437"/>
+      <w:bookmarkStart w:id="18" w:name="_Toc243586530"/>
       <w:r>
         <w:t>3.2 Source details</w:t>
       </w:r>
@@ -8147,7 +8215,7 @@
       <w:pPr>
         <w:pStyle w:val="Heading2"/>
       </w:pPr>
-      <w:bookmarkStart w:id="19" w:name="_Toc243586438"/>
+      <w:bookmarkStart w:id="19" w:name="_Toc243586531"/>
       <w:r>
         <w:t>3.3 Schema and attribute roles</w:t>
       </w:r>
@@ -8998,7 +9066,7 @@
       <w:pPr>
         <w:pStyle w:val="Heading2"/>
       </w:pPr>
-      <w:bookmarkStart w:id="20" w:name="_Toc243586439"/>
+      <w:bookmarkStart w:id="20" w:name="_Toc243586532"/>
       <w:r>
         <w:t>3.4 Preliminary preparation log</w:t>
       </w:r>
@@ -9858,7 +9926,7 @@
       <w:pPr>
         <w:pStyle w:val="Heading2"/>
       </w:pPr>
-      <w:bookmarkStart w:id="21" w:name="_Toc243586440"/>
+      <w:bookmarkStart w:id="21" w:name="_Toc243586533"/>
       <w:r>
         <w:t>3.5 Initial exposure analysis</w:t>
       </w:r>
@@ -9874,7 +9942,7 @@
           <w:noProof/>
         </w:rPr>
         <w:drawing>
-          <wp:inline distT="0" distB="0" distL="0" distR="0" wp14:anchorId="65B4FF71" wp14:editId="6BB88750">
+          <wp:inline distT="0" distB="0" distL="0" distR="0" wp14:anchorId="78B2B3F5" wp14:editId="7AAEC386">
             <wp:extent cx="5760000" cy="1552745"/>
             <wp:effectExtent l="0" t="0" r="0" b="0"/>
             <wp:docPr id="2" name="Picture 2"/>
@@ -9929,7 +9997,7 @@
       <w:pPr>
         <w:pStyle w:val="Heading2"/>
       </w:pPr>
-      <w:bookmarkStart w:id="22" w:name="_Toc243586441"/>
+      <w:bookmarkStart w:id="22" w:name="_Toc243586534"/>
       <w:r>
         <w:t>3.6 Known dataset limitations</w:t>
       </w:r>
@@ -9984,7 +10052,7 @@
       <w:pPr>
         <w:pStyle w:val="Heading1"/>
       </w:pPr>
-      <w:bookmarkStart w:id="23" w:name="_Toc243586442"/>
+      <w:bookmarkStart w:id="23" w:name="_Toc243586535"/>
       <w:r>
         <w:lastRenderedPageBreak/>
         <w:t>4. Initial Implementation</w:t>
@@ -9995,7 +10063,7 @@
       <w:pPr>
         <w:pStyle w:val="Heading2"/>
       </w:pPr>
-      <w:bookmarkStart w:id="24" w:name="_Toc243586443"/>
+      <w:bookmarkStart w:id="24" w:name="_Toc243586536"/>
       <w:r>
         <w:t>4.1 Tools and libraries</w:t>
       </w:r>
@@ -10553,7 +10621,7 @@
       <w:pPr>
         <w:pStyle w:val="Heading2"/>
       </w:pPr>
-      <w:bookmarkStart w:id="25" w:name="_Toc243586444"/>
+      <w:bookmarkStart w:id="25" w:name="_Toc243586537"/>
       <w:r>
         <w:t>4.2 Code structure</w:t>
       </w:r>
@@ -11210,7 +11278,7 @@
       <w:pPr>
         <w:pStyle w:val="Heading2"/>
       </w:pPr>
-      <w:bookmarkStart w:id="26" w:name="_Toc243586445"/>
+      <w:bookmarkStart w:id="26" w:name="_Toc243586538"/>
       <w:r>
         <w:t>4.3 Key implementation choices</w:t>
       </w:r>
@@ -11421,7 +11489,7 @@
       <w:pPr>
         <w:pStyle w:val="Heading2"/>
       </w:pPr>
-      <w:bookmarkStart w:id="27" w:name="_Toc243586446"/>
+      <w:bookmarkStart w:id="27" w:name="_Toc243586539"/>
       <w:r>
         <w:t>4.4 Inputs, processing and outputs</w:t>
       </w:r>
@@ -12127,7 +12195,7 @@
       <w:pPr>
         <w:pStyle w:val="Heading2"/>
       </w:pPr>
-      <w:bookmarkStart w:id="28" w:name="_Toc243586447"/>
+      <w:bookmarkStart w:id="28" w:name="_Toc243586540"/>
       <w:r>
         <w:t>4.5 Execution instructions</w:t>
       </w:r>
@@ -12310,7 +12378,7 @@
       <w:pPr>
         <w:pStyle w:val="Heading2"/>
       </w:pPr>
-      <w:bookmarkStart w:id="29" w:name="_Toc243586448"/>
+      <w:bookmarkStart w:id="29" w:name="_Toc243586541"/>
       <w:r>
         <w:t>4.6 Output log (excerpt)</w:t>
       </w:r>
@@ -12605,7 +12673,7 @@
       <w:pPr>
         <w:pStyle w:val="Heading2"/>
       </w:pPr>
-      <w:bookmarkStart w:id="30" w:name="_Toc243586449"/>
+      <w:bookmarkStart w:id="30" w:name="_Toc243586542"/>
       <w:r>
         <w:lastRenderedPageBreak/>
         <w:t>4.7 Verification</w:t>
@@ -12640,7 +12708,7 @@
       <w:pPr>
         <w:pStyle w:val="Heading1"/>
       </w:pPr>
-      <w:bookmarkStart w:id="31" w:name="_Toc243586450"/>
+      <w:bookmarkStart w:id="31" w:name="_Toc243586543"/>
       <w:r>
         <w:t>5. Preliminary Evaluation and Documentation</w:t>
       </w:r>
@@ -12650,7 +12718,7 @@
       <w:pPr>
         <w:pStyle w:val="Heading2"/>
       </w:pPr>
-      <w:bookmarkStart w:id="32" w:name="_Toc243586451"/>
+      <w:bookmarkStart w:id="32" w:name="_Toc243586544"/>
       <w:r>
         <w:t>5.1 Evaluation measures</w:t>
       </w:r>
@@ -13145,7 +13213,7 @@
       <w:pPr>
         <w:pStyle w:val="Heading2"/>
       </w:pPr>
-      <w:bookmarkStart w:id="33" w:name="_Toc243586452"/>
+      <w:bookmarkStart w:id="33" w:name="_Toc243586545"/>
       <w:r>
         <w:t>5.2 Baseline results (non-private models)</w:t>
       </w:r>
@@ -14195,7 +14263,7 @@
           <w:noProof/>
         </w:rPr>
         <w:drawing>
-          <wp:inline distT="0" distB="0" distL="0" distR="0" wp14:anchorId="212BEC2B" wp14:editId="2D0FFAE0">
+          <wp:inline distT="0" distB="0" distL="0" distR="0" wp14:anchorId="1D8FDFE5" wp14:editId="338D238B">
             <wp:extent cx="5400000" cy="1645407"/>
             <wp:effectExtent l="0" t="0" r="0" b="0"/>
             <wp:docPr id="3" name="Picture 3"/>
@@ -14268,7 +14336,7 @@
       <w:pPr>
         <w:pStyle w:val="Heading2"/>
       </w:pPr>
-      <w:bookmarkStart w:id="34" w:name="_Toc243586453"/>
+      <w:bookmarkStart w:id="34" w:name="_Toc243586546"/>
       <w:r>
         <w:t>5.3 Privacy exposure of the raw data</w:t>
       </w:r>
@@ -14633,7 +14701,7 @@
       <w:pPr>
         <w:pStyle w:val="Heading2"/>
       </w:pPr>
-      <w:bookmarkStart w:id="35" w:name="_Toc243586454"/>
+      <w:bookmarkStart w:id="35" w:name="_Toc243586547"/>
       <w:r>
         <w:t>5.4 Preliminary DP-SGD results</w:t>
       </w:r>
@@ -15562,7 +15630,7 @@
           <w:noProof/>
         </w:rPr>
         <w:drawing>
-          <wp:inline distT="0" distB="0" distL="0" distR="0" wp14:anchorId="59182144" wp14:editId="0DC108E5">
+          <wp:inline distT="0" distB="0" distL="0" distR="0" wp14:anchorId="48994CAF" wp14:editId="3C1FB076">
             <wp:extent cx="3960000" cy="2518183"/>
             <wp:effectExtent l="0" t="0" r="0" b="0"/>
             <wp:docPr id="4" name="Picture 4"/>
@@ -15626,7 +15694,7 @@
       <w:pPr>
         <w:pStyle w:val="Heading2"/>
       </w:pPr>
-      <w:bookmarkStart w:id="36" w:name="_Toc243586455"/>
+      <w:bookmarkStart w:id="36" w:name="_Toc243586548"/>
       <w:r>
         <w:t>5.5 Central versus local DP for histogram release</w:t>
       </w:r>
@@ -16403,7 +16471,7 @@
           <w:noProof/>
         </w:rPr>
         <w:drawing>
-          <wp:inline distT="0" distB="0" distL="0" distR="0" wp14:anchorId="417EEED7" wp14:editId="3D9D8A0B">
+          <wp:inline distT="0" distB="0" distL="0" distR="0" wp14:anchorId="26C1855F" wp14:editId="69265391">
             <wp:extent cx="3960000" cy="2366341"/>
             <wp:effectExtent l="0" t="0" r="0" b="0"/>
             <wp:docPr id="5" name="Picture 5"/>
@@ -16466,7 +16534,7 @@
       <w:pPr>
         <w:pStyle w:val="Heading2"/>
       </w:pPr>
-      <w:bookmarkStart w:id="37" w:name="_Toc243586456"/>
+      <w:bookmarkStart w:id="37" w:name="_Toc243586549"/>
       <w:r>
         <w:t>5.6 Preliminary k-anonymity</w:t>
       </w:r>
@@ -18227,7 +18295,7 @@
       <w:pPr>
         <w:pStyle w:val="Heading2"/>
       </w:pPr>
-      <w:bookmarkStart w:id="38" w:name="_Toc243586457"/>
+      <w:bookmarkStart w:id="38" w:name="_Toc243586550"/>
       <w:r>
         <w:t>5.7 Preliminary compressive privacy (PCA)</w:t>
       </w:r>
@@ -18594,7 +18662,7 @@
       <w:pPr>
         <w:pStyle w:val="Heading2"/>
       </w:pPr>
-      <w:bookmarkStart w:id="39" w:name="_Toc243586458"/>
+      <w:bookmarkStart w:id="39" w:name="_Toc243586551"/>
       <w:r>
         <w:t>5.8 Preliminary observations</w:t>
       </w:r>
@@ -18977,7 +19045,7 @@
       <w:pPr>
         <w:pStyle w:val="Heading2"/>
       </w:pPr>
-      <w:bookmarkStart w:id="40" w:name="_Toc243586459"/>
+      <w:bookmarkStart w:id="40" w:name="_Toc243586552"/>
       <w:r>
         <w:t>5.9 Known limitations at IA-1</w:t>
       </w:r>
@@ -19024,7 +19092,7 @@
       <w:pPr>
         <w:pStyle w:val="Heading2"/>
       </w:pPr>
-      <w:bookmarkStart w:id="41" w:name="_Toc243586460"/>
+      <w:bookmarkStart w:id="41" w:name="_Toc243586553"/>
       <w:r>
         <w:t>5.10 Proposed evaluation plan for IA-2</w:t>
       </w:r>
@@ -19730,7 +19798,7 @@
       <w:pPr>
         <w:pStyle w:val="Heading2"/>
       </w:pPr>
-      <w:bookmarkStart w:id="42" w:name="_Toc243586461"/>
+      <w:bookmarkStart w:id="42" w:name="_Toc243586554"/>
       <w:r>
         <w:t>5.11 Individual contribution statement</w:t>
       </w:r>
@@ -19761,11 +19829,32 @@
       <w:pPr>
         <w:pStyle w:val="Heading1"/>
       </w:pPr>
-      <w:bookmarkStart w:id="43" w:name="_Toc243586462"/>
+      <w:bookmarkStart w:id="43" w:name="_Toc243586555"/>
+      <w:r>
+        <w:t>Acknowledgement</w:t>
+      </w:r>
+      <w:bookmarkEnd w:id="43"/>
+    </w:p>
+    <w:p>
+      <w:pPr>
+        <w:jc w:val="both"/>
+      </w:pPr>
+      <w:r>
+        <w:rPr>
+          <w:sz w:val="20"/>
+        </w:rPr>
+        <w:t>I acknowledge the use of Claude (Anthropic), an AI assistant, for support with code development and report preparation.</w:t>
+      </w:r>
+    </w:p>
+    <w:p>
+      <w:pPr>
+        <w:pStyle w:val="Heading1"/>
+      </w:pPr>
+      <w:bookmarkStart w:id="44" w:name="_Toc243586556"/>
       <w:r>
         <w:t>References</w:t>
       </w:r>
-      <w:bookmarkEnd w:id="43"/>
+      <w:bookmarkEnd w:id="44"/>
     </w:p>
     <w:p>
       <w:r>
@@ -19885,6 +19974,7 @@
         <w:rPr>
           <w:sz w:val="19"/>
         </w:rPr>
+        <w:lastRenderedPageBreak/>
         <w:t xml:space="preserve">[7] P. Kairouz, K. Bonawitz and D. Ramage, “Discrete distribution estimation under local privacy,” in </w:t>
       </w:r>
       <w:r>
@@ -19927,7 +20017,6 @@
         <w:rPr>
           <w:sz w:val="19"/>
         </w:rPr>
-        <w:lastRenderedPageBreak/>
         <w:t xml:space="preserve">[9] N. Wang, X. Xiao, Y. Yang, J. Zhao, S. C. Hui, H. Shin, J. Shin and G. Yu, “Collecting and analyzing multidimensional data with local differential privacy,” in </w:t>
       </w:r>
       <w:r>
@@ -20738,31 +20827,31 @@
       </w:rPr>
     </w:lvl>
   </w:abstractNum>
-  <w:num w:numId="1" w16cid:durableId="2062483665">
+  <w:num w:numId="1" w16cid:durableId="2056616653">
     <w:abstractNumId w:val="8"/>
   </w:num>
-  <w:num w:numId="2" w16cid:durableId="1176110032">
+  <w:num w:numId="2" w16cid:durableId="1850555709">
     <w:abstractNumId w:val="6"/>
   </w:num>
-  <w:num w:numId="3" w16cid:durableId="862128760">
+  <w:num w:numId="3" w16cid:durableId="1041980724">
     <w:abstractNumId w:val="5"/>
   </w:num>
-  <w:num w:numId="4" w16cid:durableId="437065728">
+  <w:num w:numId="4" w16cid:durableId="2062098214">
     <w:abstractNumId w:val="4"/>
   </w:num>
-  <w:num w:numId="5" w16cid:durableId="2080786023">
+  <w:num w:numId="5" w16cid:durableId="1924533659">
     <w:abstractNumId w:val="7"/>
   </w:num>
-  <w:num w:numId="6" w16cid:durableId="1633098826">
+  <w:num w:numId="6" w16cid:durableId="1948342369">
     <w:abstractNumId w:val="3"/>
   </w:num>
-  <w:num w:numId="7" w16cid:durableId="1297221227">
+  <w:num w:numId="7" w16cid:durableId="1876847430">
     <w:abstractNumId w:val="2"/>
   </w:num>
-  <w:num w:numId="8" w16cid:durableId="1597589828">
+  <w:num w:numId="8" w16cid:durableId="2147162592">
     <w:abstractNumId w:val="1"/>
   </w:num>
-  <w:num w:numId="9" w16cid:durableId="604966019">
+  <w:num w:numId="9" w16cid:durableId="2118017866">
     <w:abstractNumId w:val="0"/>
   </w:num>
 </w:numbering>
@@ -32152,7 +32241,7 @@
     <w:autoRedefine/>
     <w:uiPriority w:val="39"/>
     <w:unhideWhenUsed/>
-    <w:rsid w:val="00746EA2"/>
+    <w:rsid w:val="00286809"/>
     <w:pPr>
       <w:spacing w:after="100"/>
     </w:pPr>
@@ -32164,7 +32253,7 @@
     <w:autoRedefine/>
     <w:uiPriority w:val="39"/>
     <w:unhideWhenUsed/>
-    <w:rsid w:val="00746EA2"/>
+    <w:rsid w:val="00286809"/>
     <w:pPr>
       <w:spacing w:after="100"/>
       <w:ind w:left="220"/>
@@ -32175,7 +32264,7 @@
     <w:basedOn w:val="DefaultParagraphFont"/>
     <w:uiPriority w:val="99"/>
     <w:unhideWhenUsed/>
-    <w:rsid w:val="00746EA2"/>
+    <w:rsid w:val="00286809"/>
     <w:rPr>
       <w:color w:val="0000FF" w:themeColor="hyperlink"/>
       <w:u w:val="single"/>

</xml_diff>